<commit_message>
docs: complete presentation & technical docs with member task matrix, technology selection comparison matrix and demo backup plan (.docx)
</commit_message>
<xml_diff>
--- a/Tai_Lieu_Giai_Thich_Chuyen_Sau_Do_An_HaiSan_VN.docx
+++ b/Tai_Lieu_Giai_Thich_Chuyen_Sau_Do_An_HaiSan_VN.docx
@@ -33,6 +33,727 @@
         </w:rPr>
         <w:t xml:space="preserve">Sơ Đồ Hệ Thống Đồ Họa Đẹp Mắt, Nguyên Lý Vận Hành &amp; Chi Tiết 25+ Use Cases Chuyên Gia (SWP391)</w:t>
       </w:r>
+    </w:p>
+    <w:p>
+      <w:pPr>
+        <w:pStyle w:val="Heading1"/>
+        <w:spacing w:after="180" w:before="240"/>
+      </w:pPr>
+      <w:r>
+        <w:rPr>
+          <w:b/>
+          <w:bCs/>
+          <w:color w:val="0F172A"/>
+          <w:sz w:val="26"/>
+          <w:szCs w:val="26"/>
+        </w:rPr>
+        <w:t xml:space="preserve">CHƯƠNG 0. MA TRẬN PHÂN CÔNG CÔNG VIỆC NHÓM (MEMBER RESPONSIBILITY MATRIX)</w:t>
+      </w:r>
+    </w:p>
+    <w:tbl>
+      <w:tblPr>
+        <w:tblW w:type="pct" w:w="100%"/>
+        <w:tblBorders>
+          <w:top w:val="single" w:color="auto" w:sz="4"/>
+          <w:left w:val="single" w:color="auto" w:sz="4"/>
+          <w:bottom w:val="single" w:color="auto" w:sz="4"/>
+          <w:right w:val="single" w:color="auto" w:sz="4"/>
+          <w:insideH w:val="single" w:color="auto" w:sz="4"/>
+          <w:insideV w:val="single" w:color="auto" w:sz="4"/>
+        </w:tblBorders>
+      </w:tblPr>
+      <w:tblGrid>
+        <w:gridCol w:w="100"/>
+        <w:gridCol w:w="100"/>
+        <w:gridCol w:w="100"/>
+      </w:tblGrid>
+      <w:tr>
+        <w:tc>
+          <w:tcPr>
+            <w:tcW w:type="pct" w:w="25%"/>
+            <w:shd w:fill="0F172A" w:val="clear"/>
+            <w:tcMar>
+              <w:top w:type="dxa" w:w="140"/>
+              <w:left w:type="dxa" w:w="180"/>
+              <w:bottom w:type="dxa" w:w="140"/>
+              <w:right w:type="dxa" w:w="180"/>
+            </w:tcMar>
+          </w:tcPr>
+          <w:p>
+            <w:pPr>
+              <w:jc w:val="left"/>
+            </w:pPr>
+            <w:r>
+              <w:rPr>
+                <w:b/>
+                <w:bCs/>
+                <w:color w:val="FFFFFF"/>
+                <w:sz w:val="22"/>
+                <w:szCs w:val="22"/>
+              </w:rPr>
+              <w:t xml:space="preserve">STT &amp; THÀNH VIÊN</w:t>
+            </w:r>
+          </w:p>
+        </w:tc>
+        <w:tc>
+          <w:tcPr>
+            <w:tcW w:type="pct" w:w="50%"/>
+            <w:shd w:fill="0F172A" w:val="clear"/>
+            <w:tcMar>
+              <w:top w:type="dxa" w:w="140"/>
+              <w:left w:type="dxa" w:w="180"/>
+              <w:bottom w:type="dxa" w:w="140"/>
+              <w:right w:type="dxa" w:w="180"/>
+            </w:tcMar>
+          </w:tcPr>
+          <w:p>
+            <w:pPr>
+              <w:jc w:val="left"/>
+            </w:pPr>
+            <w:r>
+              <w:rPr>
+                <w:b/>
+                <w:bCs/>
+                <w:color w:val="FFFFFF"/>
+                <w:sz w:val="22"/>
+                <w:szCs w:val="22"/>
+              </w:rPr>
+              <w:t xml:space="preserve">VAI TRÒ &amp; PHẦN VIỆC ĐẢM NHẬN</w:t>
+            </w:r>
+          </w:p>
+        </w:tc>
+        <w:tc>
+          <w:tcPr>
+            <w:tcW w:type="pct" w:w="25%"/>
+            <w:shd w:fill="0F172A" w:val="clear"/>
+            <w:tcMar>
+              <w:top w:type="dxa" w:w="140"/>
+              <w:left w:type="dxa" w:w="180"/>
+              <w:bottom w:type="dxa" w:w="140"/>
+              <w:right w:type="dxa" w:w="180"/>
+            </w:tcMar>
+          </w:tcPr>
+          <w:p>
+            <w:pPr>
+              <w:jc w:val="left"/>
+            </w:pPr>
+            <w:r>
+              <w:rPr>
+                <w:b/>
+                <w:bCs/>
+                <w:color w:val="FFFFFF"/>
+                <w:sz w:val="22"/>
+                <w:szCs w:val="22"/>
+              </w:rPr>
+              <w:t xml:space="preserve">TỶ LỆ ĐÓNG GÓP</w:t>
+            </w:r>
+          </w:p>
+        </w:tc>
+      </w:tr>
+      <w:tr>
+        <w:tc>
+          <w:tcPr>
+            <w:tcW w:type="pct" w:w="25%"/>
+            <w:tcBorders>
+              <w:top w:val="single" w:color="CBD5E1" w:sz="1"/>
+              <w:left w:val="single" w:color="CBD5E1" w:sz="1"/>
+              <w:bottom w:val="single" w:color="CBD5E1" w:sz="1"/>
+              <w:right w:val="single" w:color="CBD5E1" w:sz="1"/>
+            </w:tcBorders>
+            <w:shd w:fill="F8FAFC" w:val="clear"/>
+            <w:tcMar>
+              <w:top w:type="dxa" w:w="140"/>
+              <w:left w:type="dxa" w:w="180"/>
+              <w:bottom w:type="dxa" w:w="140"/>
+              <w:right w:type="dxa" w:w="180"/>
+            </w:tcMar>
+          </w:tcPr>
+          <w:p>
+            <w:pPr>
+              <w:spacing w:after="80"/>
+            </w:pPr>
+            <w:r>
+              <w:rPr>
+                <w:b/>
+                <w:bCs/>
+                <w:color w:val="1E293B"/>
+                <w:sz w:val="20"/>
+                <w:szCs w:val="20"/>
+              </w:rPr>
+              <w:t xml:space="preserve">1. HE186165</w:t>
+            </w:r>
+          </w:p>
+          <w:p>
+            <w:pPr>
+              <w:spacing w:after="80"/>
+            </w:pPr>
+            <w:r>
+              <w:rPr>
+                <w:b/>
+                <w:bCs/>
+                <w:color w:val="1E293B"/>
+                <w:sz w:val="20"/>
+                <w:szCs w:val="20"/>
+              </w:rPr>
+              <w:t xml:space="preserve">(Leader)</w:t>
+            </w:r>
+          </w:p>
+        </w:tc>
+        <w:tc>
+          <w:tcPr>
+            <w:tcW w:type="pct" w:w="50%"/>
+            <w:tcBorders>
+              <w:top w:val="single" w:color="CBD5E1" w:sz="1"/>
+              <w:left w:val="single" w:color="CBD5E1" w:sz="1"/>
+              <w:bottom w:val="single" w:color="CBD5E1" w:sz="1"/>
+              <w:right w:val="single" w:color="CBD5E1" w:sz="1"/>
+            </w:tcBorders>
+            <w:shd w:fill="FFFFFF" w:val="clear"/>
+            <w:tcMar>
+              <w:top w:type="dxa" w:w="140"/>
+              <w:left w:type="dxa" w:w="180"/>
+              <w:bottom w:type="dxa" w:w="140"/>
+              <w:right w:type="dxa" w:w="180"/>
+            </w:tcMar>
+          </w:tcPr>
+          <w:p>
+            <w:pPr>
+              <w:spacing w:after="80"/>
+            </w:pPr>
+            <w:r>
+              <w:rPr>
+                <w:b w:val="false"/>
+                <w:bCs w:val="false"/>
+                <w:color w:val="1E293B"/>
+                <w:sz w:val="20"/>
+                <w:szCs w:val="20"/>
+              </w:rPr>
+              <w:t xml:space="preserve">• Thiết kế Kiến trúc Clean Architecture 4 tầng &amp; DDD</w:t>
+            </w:r>
+          </w:p>
+          <w:p>
+            <w:pPr>
+              <w:spacing w:after="80"/>
+            </w:pPr>
+            <w:r>
+              <w:rPr>
+                <w:b w:val="false"/>
+                <w:bCs w:val="false"/>
+                <w:color w:val="1E293B"/>
+                <w:sz w:val="20"/>
+                <w:szCs w:val="20"/>
+              </w:rPr>
+              <w:t xml:space="preserve">• Module IAM (Auth JWT HttpOnly Cookie, Google OAuth2)</w:t>
+            </w:r>
+          </w:p>
+          <w:p>
+            <w:pPr>
+              <w:spacing w:after="80"/>
+            </w:pPr>
+            <w:r>
+              <w:rPr>
+                <w:b w:val="false"/>
+                <w:bCs w:val="false"/>
+                <w:color w:val="1E293B"/>
+                <w:sz w:val="20"/>
+                <w:szCs w:val="20"/>
+              </w:rPr>
+              <w:t xml:space="preserve">• Refactor UX DatePicker Native &amp; Format tiền VND chuẩn</w:t>
+            </w:r>
+          </w:p>
+          <w:p>
+            <w:pPr>
+              <w:spacing w:after="80"/>
+            </w:pPr>
+            <w:r>
+              <w:rPr>
+                <w:b w:val="false"/>
+                <w:bCs w:val="false"/>
+                <w:color w:val="1E293B"/>
+                <w:sz w:val="20"/>
+                <w:szCs w:val="20"/>
+              </w:rPr>
+              <w:t xml:space="preserve">• Viết bộ Unit &amp; E2E tests</w:t>
+            </w:r>
+          </w:p>
+        </w:tc>
+        <w:tc>
+          <w:tcPr>
+            <w:tcW w:type="pct" w:w="25%"/>
+            <w:tcBorders>
+              <w:top w:val="single" w:color="CBD5E1" w:sz="1"/>
+              <w:left w:val="single" w:color="CBD5E1" w:sz="1"/>
+              <w:bottom w:val="single" w:color="CBD5E1" w:sz="1"/>
+              <w:right w:val="single" w:color="CBD5E1" w:sz="1"/>
+            </w:tcBorders>
+            <w:shd w:fill="FFFFFF" w:val="clear"/>
+            <w:tcMar>
+              <w:top w:type="dxa" w:w="140"/>
+              <w:left w:type="dxa" w:w="180"/>
+              <w:bottom w:type="dxa" w:w="140"/>
+              <w:right w:type="dxa" w:w="180"/>
+            </w:tcMar>
+          </w:tcPr>
+          <w:p>
+            <w:pPr>
+              <w:spacing w:after="80"/>
+            </w:pPr>
+            <w:r>
+              <w:rPr>
+                <w:b w:val="false"/>
+                <w:bCs w:val="false"/>
+                <w:color w:val="1E293B"/>
+                <w:sz w:val="20"/>
+                <w:szCs w:val="20"/>
+              </w:rPr>
+              <w:t xml:space="preserve">25% (Hoàn thành 100% nhiệm vụ)</w:t>
+            </w:r>
+          </w:p>
+        </w:tc>
+      </w:tr>
+      <w:tr>
+        <w:tc>
+          <w:tcPr>
+            <w:tcW w:type="pct" w:w="25%"/>
+            <w:tcBorders>
+              <w:top w:val="single" w:color="CBD5E1" w:sz="1"/>
+              <w:left w:val="single" w:color="CBD5E1" w:sz="1"/>
+              <w:bottom w:val="single" w:color="CBD5E1" w:sz="1"/>
+              <w:right w:val="single" w:color="CBD5E1" w:sz="1"/>
+            </w:tcBorders>
+            <w:shd w:fill="F8FAFC" w:val="clear"/>
+            <w:tcMar>
+              <w:top w:type="dxa" w:w="140"/>
+              <w:left w:type="dxa" w:w="180"/>
+              <w:bottom w:type="dxa" w:w="140"/>
+              <w:right w:type="dxa" w:w="180"/>
+            </w:tcMar>
+          </w:tcPr>
+          <w:p>
+            <w:pPr>
+              <w:spacing w:after="80"/>
+            </w:pPr>
+            <w:r>
+              <w:rPr>
+                <w:b/>
+                <w:bCs/>
+                <w:color w:val="1E293B"/>
+                <w:sz w:val="20"/>
+                <w:szCs w:val="20"/>
+              </w:rPr>
+              <w:t xml:space="preserve">2. DE190058</w:t>
+            </w:r>
+          </w:p>
+          <w:p>
+            <w:pPr>
+              <w:spacing w:after="80"/>
+            </w:pPr>
+            <w:r>
+              <w:rPr>
+                <w:b/>
+                <w:bCs/>
+                <w:color w:val="1E293B"/>
+                <w:sz w:val="20"/>
+                <w:szCs w:val="20"/>
+              </w:rPr>
+              <w:t xml:space="preserve">(Sub-lead)</w:t>
+            </w:r>
+          </w:p>
+        </w:tc>
+        <w:tc>
+          <w:tcPr>
+            <w:tcW w:type="pct" w:w="50%"/>
+            <w:tcBorders>
+              <w:top w:val="single" w:color="CBD5E1" w:sz="1"/>
+              <w:left w:val="single" w:color="CBD5E1" w:sz="1"/>
+              <w:bottom w:val="single" w:color="CBD5E1" w:sz="1"/>
+              <w:right w:val="single" w:color="CBD5E1" w:sz="1"/>
+            </w:tcBorders>
+            <w:shd w:fill="FFFFFF" w:val="clear"/>
+            <w:tcMar>
+              <w:top w:type="dxa" w:w="140"/>
+              <w:left w:type="dxa" w:w="180"/>
+              <w:bottom w:type="dxa" w:w="140"/>
+              <w:right w:type="dxa" w:w="180"/>
+            </w:tcMar>
+          </w:tcPr>
+          <w:p>
+            <w:pPr>
+              <w:spacing w:after="80"/>
+            </w:pPr>
+            <w:r>
+              <w:rPr>
+                <w:b w:val="false"/>
+                <w:bCs w:val="false"/>
+                <w:color w:val="1E293B"/>
+                <w:sz w:val="20"/>
+                <w:szCs w:val="20"/>
+              </w:rPr>
+              <w:t xml:space="preserve">• Security Audit backend (ObjectId sanitization, NoSQL Injection)</w:t>
+            </w:r>
+          </w:p>
+          <w:p>
+            <w:pPr>
+              <w:spacing w:after="80"/>
+            </w:pPr>
+            <w:r>
+              <w:rPr>
+                <w:b w:val="false"/>
+                <w:bCs w:val="false"/>
+                <w:color w:val="1E293B"/>
+                <w:sz w:val="20"/>
+                <w:szCs w:val="20"/>
+              </w:rPr>
+              <w:t xml:space="preserve">• Module Product &amp; Đồng bộ giao dịch Mẻ cá theo lô</w:t>
+            </w:r>
+          </w:p>
+          <w:p>
+            <w:pPr>
+              <w:spacing w:after="80"/>
+            </w:pPr>
+            <w:r>
+              <w:rPr>
+                <w:b w:val="false"/>
+                <w:bCs w:val="false"/>
+                <w:color w:val="1E293B"/>
+                <w:sz w:val="20"/>
+                <w:szCs w:val="20"/>
+              </w:rPr>
+              <w:t xml:space="preserve">• Quy trình xóa tài khoản GDPR ACID Transaction</w:t>
+            </w:r>
+          </w:p>
+        </w:tc>
+        <w:tc>
+          <w:tcPr>
+            <w:tcW w:type="pct" w:w="25%"/>
+            <w:tcBorders>
+              <w:top w:val="single" w:color="CBD5E1" w:sz="1"/>
+              <w:left w:val="single" w:color="CBD5E1" w:sz="1"/>
+              <w:bottom w:val="single" w:color="CBD5E1" w:sz="1"/>
+              <w:right w:val="single" w:color="CBD5E1" w:sz="1"/>
+            </w:tcBorders>
+            <w:shd w:fill="FFFFFF" w:val="clear"/>
+            <w:tcMar>
+              <w:top w:type="dxa" w:w="140"/>
+              <w:left w:type="dxa" w:w="180"/>
+              <w:bottom w:type="dxa" w:w="140"/>
+              <w:right w:type="dxa" w:w="180"/>
+            </w:tcMar>
+          </w:tcPr>
+          <w:p>
+            <w:pPr>
+              <w:spacing w:after="80"/>
+            </w:pPr>
+            <w:r>
+              <w:rPr>
+                <w:b w:val="false"/>
+                <w:bCs w:val="false"/>
+                <w:color w:val="1E293B"/>
+                <w:sz w:val="20"/>
+                <w:szCs w:val="20"/>
+              </w:rPr>
+              <w:t xml:space="preserve">25% (Hoàn thành 100% nhiệm vụ)</w:t>
+            </w:r>
+          </w:p>
+        </w:tc>
+      </w:tr>
+      <w:tr>
+        <w:tc>
+          <w:tcPr>
+            <w:tcW w:type="pct" w:w="25%"/>
+            <w:tcBorders>
+              <w:top w:val="single" w:color="CBD5E1" w:sz="1"/>
+              <w:left w:val="single" w:color="CBD5E1" w:sz="1"/>
+              <w:bottom w:val="single" w:color="CBD5E1" w:sz="1"/>
+              <w:right w:val="single" w:color="CBD5E1" w:sz="1"/>
+            </w:tcBorders>
+            <w:shd w:fill="F8FAFC" w:val="clear"/>
+            <w:tcMar>
+              <w:top w:type="dxa" w:w="140"/>
+              <w:left w:type="dxa" w:w="180"/>
+              <w:bottom w:type="dxa" w:w="140"/>
+              <w:right w:type="dxa" w:w="180"/>
+            </w:tcMar>
+          </w:tcPr>
+          <w:p>
+            <w:pPr>
+              <w:spacing w:after="80"/>
+            </w:pPr>
+            <w:r>
+              <w:rPr>
+                <w:b/>
+                <w:bCs/>
+                <w:color w:val="1E293B"/>
+                <w:sz w:val="20"/>
+                <w:szCs w:val="20"/>
+              </w:rPr>
+              <w:t xml:space="preserve">3. DE191012</w:t>
+            </w:r>
+          </w:p>
+          <w:p>
+            <w:pPr>
+              <w:spacing w:after="80"/>
+            </w:pPr>
+            <w:r>
+              <w:rPr>
+                <w:b/>
+                <w:bCs/>
+                <w:color w:val="1E293B"/>
+                <w:sz w:val="20"/>
+                <w:szCs w:val="20"/>
+              </w:rPr>
+              <w:t xml:space="preserve">(Core Dev)</w:t>
+            </w:r>
+          </w:p>
+        </w:tc>
+        <w:tc>
+          <w:tcPr>
+            <w:tcW w:type="pct" w:w="50%"/>
+            <w:tcBorders>
+              <w:top w:val="single" w:color="CBD5E1" w:sz="1"/>
+              <w:left w:val="single" w:color="CBD5E1" w:sz="1"/>
+              <w:bottom w:val="single" w:color="CBD5E1" w:sz="1"/>
+              <w:right w:val="single" w:color="CBD5E1" w:sz="1"/>
+            </w:tcBorders>
+            <w:shd w:fill="FFFFFF" w:val="clear"/>
+            <w:tcMar>
+              <w:top w:type="dxa" w:w="140"/>
+              <w:left w:type="dxa" w:w="180"/>
+              <w:bottom w:type="dxa" w:w="140"/>
+              <w:right w:type="dxa" w:w="180"/>
+            </w:tcMar>
+          </w:tcPr>
+          <w:p>
+            <w:pPr>
+              <w:spacing w:after="80"/>
+            </w:pPr>
+            <w:r>
+              <w:rPr>
+                <w:b w:val="false"/>
+                <w:bCs w:val="false"/>
+                <w:color w:val="1E293B"/>
+                <w:sz w:val="20"/>
+                <w:szCs w:val="20"/>
+              </w:rPr>
+              <w:t xml:space="preserve">• Kênh Chat Realtime 1-1 Socket.IO &amp; Presence online/offline</w:t>
+            </w:r>
+          </w:p>
+          <w:p>
+            <w:pPr>
+              <w:spacing w:after="80"/>
+            </w:pPr>
+            <w:r>
+              <w:rPr>
+                <w:b w:val="false"/>
+                <w:bCs w:val="false"/>
+                <w:color w:val="1E293B"/>
+                <w:sz w:val="20"/>
+                <w:szCs w:val="20"/>
+              </w:rPr>
+              <w:t xml:space="preserve">• Hệ thống Thông báo chuông Realtime</w:t>
+            </w:r>
+          </w:p>
+          <w:p>
+            <w:pPr>
+              <w:spacing w:after="80"/>
+            </w:pPr>
+            <w:r>
+              <w:rPr>
+                <w:b w:val="false"/>
+                <w:bCs w:val="false"/>
+                <w:color w:val="1E293B"/>
+                <w:sz w:val="20"/>
+                <w:szCs w:val="20"/>
+              </w:rPr>
+              <w:t xml:space="preserve">• Tích hợp Bản đồ GeoJSON Leaflet &amp; Haversine distance</w:t>
+            </w:r>
+          </w:p>
+        </w:tc>
+        <w:tc>
+          <w:tcPr>
+            <w:tcW w:type="pct" w:w="25%"/>
+            <w:tcBorders>
+              <w:top w:val="single" w:color="CBD5E1" w:sz="1"/>
+              <w:left w:val="single" w:color="CBD5E1" w:sz="1"/>
+              <w:bottom w:val="single" w:color="CBD5E1" w:sz="1"/>
+              <w:right w:val="single" w:color="CBD5E1" w:sz="1"/>
+            </w:tcBorders>
+            <w:shd w:fill="FFFFFF" w:val="clear"/>
+            <w:tcMar>
+              <w:top w:type="dxa" w:w="140"/>
+              <w:left w:type="dxa" w:w="180"/>
+              <w:bottom w:type="dxa" w:w="140"/>
+              <w:right w:type="dxa" w:w="180"/>
+            </w:tcMar>
+          </w:tcPr>
+          <w:p>
+            <w:pPr>
+              <w:spacing w:after="80"/>
+            </w:pPr>
+            <w:r>
+              <w:rPr>
+                <w:b w:val="false"/>
+                <w:bCs w:val="false"/>
+                <w:color w:val="1E293B"/>
+                <w:sz w:val="20"/>
+                <w:szCs w:val="20"/>
+              </w:rPr>
+              <w:t xml:space="preserve">25% (Hoàn thành 100% nhiệm vụ)</w:t>
+            </w:r>
+          </w:p>
+        </w:tc>
+      </w:tr>
+      <w:tr>
+        <w:tc>
+          <w:tcPr>
+            <w:tcW w:type="pct" w:w="25%"/>
+            <w:tcBorders>
+              <w:top w:val="single" w:color="CBD5E1" w:sz="1"/>
+              <w:left w:val="single" w:color="CBD5E1" w:sz="1"/>
+              <w:bottom w:val="single" w:color="CBD5E1" w:sz="1"/>
+              <w:right w:val="single" w:color="CBD5E1" w:sz="1"/>
+            </w:tcBorders>
+            <w:shd w:fill="F8FAFC" w:val="clear"/>
+            <w:tcMar>
+              <w:top w:type="dxa" w:w="140"/>
+              <w:left w:type="dxa" w:w="180"/>
+              <w:bottom w:type="dxa" w:w="140"/>
+              <w:right w:type="dxa" w:w="180"/>
+            </w:tcMar>
+          </w:tcPr>
+          <w:p>
+            <w:pPr>
+              <w:spacing w:after="80"/>
+            </w:pPr>
+            <w:r>
+              <w:rPr>
+                <w:b/>
+                <w:bCs/>
+                <w:color w:val="1E293B"/>
+                <w:sz w:val="20"/>
+                <w:szCs w:val="20"/>
+              </w:rPr>
+              <w:t xml:space="preserve">4. DE191087</w:t>
+            </w:r>
+          </w:p>
+          <w:p>
+            <w:pPr>
+              <w:spacing w:after="80"/>
+            </w:pPr>
+            <w:r>
+              <w:rPr>
+                <w:b/>
+                <w:bCs/>
+                <w:color w:val="1E293B"/>
+                <w:sz w:val="20"/>
+                <w:szCs w:val="20"/>
+              </w:rPr>
+              <w:t xml:space="preserve">(Core Dev)</w:t>
+            </w:r>
+          </w:p>
+        </w:tc>
+        <w:tc>
+          <w:tcPr>
+            <w:tcW w:type="pct" w:w="50%"/>
+            <w:tcBorders>
+              <w:top w:val="single" w:color="CBD5E1" w:sz="1"/>
+              <w:left w:val="single" w:color="CBD5E1" w:sz="1"/>
+              <w:bottom w:val="single" w:color="CBD5E1" w:sz="1"/>
+              <w:right w:val="single" w:color="CBD5E1" w:sz="1"/>
+            </w:tcBorders>
+            <w:shd w:fill="FFFFFF" w:val="clear"/>
+            <w:tcMar>
+              <w:top w:type="dxa" w:w="140"/>
+              <w:left w:type="dxa" w:w="180"/>
+              <w:bottom w:type="dxa" w:w="140"/>
+              <w:right w:type="dxa" w:w="180"/>
+            </w:tcMar>
+          </w:tcPr>
+          <w:p>
+            <w:pPr>
+              <w:spacing w:after="80"/>
+            </w:pPr>
+            <w:r>
+              <w:rPr>
+                <w:b w:val="false"/>
+                <w:bCs w:val="false"/>
+                <w:color w:val="1E293B"/>
+                <w:sz w:val="20"/>
+                <w:szCs w:val="20"/>
+              </w:rPr>
+              <w:t xml:space="preserve">• Diễn đàn Cộng đồng (Post &amp; Comment lồng nhau)</w:t>
+            </w:r>
+          </w:p>
+          <w:p>
+            <w:pPr>
+              <w:spacing w:after="80"/>
+            </w:pPr>
+            <w:r>
+              <w:rPr>
+                <w:b w:val="false"/>
+                <w:bCs w:val="false"/>
+                <w:color w:val="1E293B"/>
+                <w:sz w:val="20"/>
+                <w:szCs w:val="20"/>
+              </w:rPr>
+              <w:t xml:space="preserve">• Module Công thức nấu ăn (Recipe)</w:t>
+            </w:r>
+          </w:p>
+          <w:p>
+            <w:pPr>
+              <w:spacing w:after="80"/>
+            </w:pPr>
+            <w:r>
+              <w:rPr>
+                <w:b w:val="false"/>
+                <w:bCs w:val="false"/>
+                <w:color w:val="1E293B"/>
+                <w:sz w:val="20"/>
+                <w:szCs w:val="20"/>
+              </w:rPr>
+              <w:t xml:space="preserve">• Hệ thống Đánh giá sao (Review &amp; Star rating)</w:t>
+            </w:r>
+          </w:p>
+        </w:tc>
+        <w:tc>
+          <w:tcPr>
+            <w:tcW w:type="pct" w:w="25%"/>
+            <w:tcBorders>
+              <w:top w:val="single" w:color="CBD5E1" w:sz="1"/>
+              <w:left w:val="single" w:color="CBD5E1" w:sz="1"/>
+              <w:bottom w:val="single" w:color="CBD5E1" w:sz="1"/>
+              <w:right w:val="single" w:color="CBD5E1" w:sz="1"/>
+            </w:tcBorders>
+            <w:shd w:fill="FFFFFF" w:val="clear"/>
+            <w:tcMar>
+              <w:top w:type="dxa" w:w="140"/>
+              <w:left w:type="dxa" w:w="180"/>
+              <w:bottom w:type="dxa" w:w="140"/>
+              <w:right w:type="dxa" w:w="180"/>
+            </w:tcMar>
+          </w:tcPr>
+          <w:p>
+            <w:pPr>
+              <w:spacing w:after="80"/>
+            </w:pPr>
+            <w:r>
+              <w:rPr>
+                <w:b w:val="false"/>
+                <w:bCs w:val="false"/>
+                <w:color w:val="1E293B"/>
+                <w:sz w:val="20"/>
+                <w:szCs w:val="20"/>
+              </w:rPr>
+              <w:t xml:space="preserve">25% (Hoàn thành 100% nhiệm vụ)</w:t>
+            </w:r>
+          </w:p>
+        </w:tc>
+      </w:tr>
+    </w:tbl>
+    <w:p>
+      <w:pPr>
+        <w:spacing w:after="240"/>
+      </w:pPr>
     </w:p>
     <w:p>
       <w:pPr>

</xml_diff>